<commit_message>
fix(approval): implementasi method approve & reject pada lembur dan dinas, serta update dokumentasi
- Menambahkan method approve() dan reject() pada OvertimeRequestController dan OfficeTripController
- Menambahkan feature test untuk alur persetujuan & penolakan lembur dan dinas
- Memperbarui panduan penggunaan aplikasi (Panduan_Penggunaan_Aplikasi_Karyawan.docx dan Readme.md)
- Menambahkan rekapitulasi tabel pengerjaan periode 26 September - 25 Oktober 2026
</commit_message>
<xml_diff>
--- a/Panduan_Penggunaan_Aplikasi_Karyawan.docx
+++ b/Panduan_Penggunaan_Aplikasi_Karyawan.docx
@@ -4,7 +4,7 @@
   <w:body>
     <w:p>
       <w:pPr>
-        <w:spacing w:before="480" w:after="120"/>
+        <w:spacing w:before="400" w:after="120"/>
         <w:jc w:val="center"/>
       </w:pPr>
       <w:r>
@@ -12,30 +12,30 @@
           <w:rFonts w:ascii="Arial" w:hAnsi="Arial"/>
           <w:b/>
           <w:color w:val="800020"/>
-          <w:sz w:val="48"/>
+          <w:sz w:val="44"/>
         </w:rPr>
-        <w:t>PANDUAN PENGGUNAAN APLIKASI</w:t>
+        <w:t>PANDUAN PENGGUNAAN APLIKASI KARYAWAN</w:t>
       </w:r>
     </w:p>
     <w:p>
       <w:pPr>
-        <w:spacing w:after="480"/>
+        <w:spacing w:after="400"/>
         <w:jc w:val="center"/>
       </w:pPr>
       <w:r>
         <w:rPr>
           <w:rFonts w:ascii="Arial" w:hAnsi="Arial"/>
           <w:color w:val="A3082F"/>
-          <w:sz w:val="26"/>
+          <w:sz w:val="23"/>
         </w:rPr>
-        <w:t>Sistem Manajemen Absensi, Pengajuan Izin, Lembur, Dinas Luar &amp; Approval</w:t>
+        <w:t>Sistem Manajemen Absensi GPS, Pengajuan Izin, Lembur, Dinas Luar, Approval &amp; Penggajian (Payroll)</w:t>
         <w:br/>
-        <w:t>PT Sinarta MJS</w:t>
+        <w:t>PT Sinarta MJS — Edisi Pembaruan Terkini (Oktober 2026)</w:t>
       </w:r>
     </w:p>
     <w:p>
       <w:pPr>
-        <w:spacing w:after="360"/>
+        <w:spacing w:after="320"/>
         <w:jc w:val="center"/>
       </w:pPr>
       <w:r>
@@ -55,7 +55,7 @@
           <w:rFonts w:ascii="Arial" w:hAnsi="Arial"/>
           <w:b/>
           <w:color w:val="800020"/>
-          <w:sz w:val="32"/>
+          <w:sz w:val="30"/>
         </w:rPr>
         <w:t>1. PENDAHULUAN</w:t>
       </w:r>
@@ -68,9 +68,9 @@
         <w:rPr>
           <w:rFonts w:ascii="Arial" w:hAnsi="Arial"/>
           <w:color w:val="374151"/>
-          <w:sz w:val="21"/>
+          <w:sz w:val="20"/>
         </w:rPr>
-        <w:t>Dokumen panduan ini disusun untuk memberikan petunjuk langkah demi langkah kepada seluruh pengguna (Karyawan, Atasan, dan Admin) dalam mengoperasikan Aplikasi Manajemen Karyawan Sinarta MJS. Aplikasi ini dirancang untuk mempermudah pencatatan absensi harian berbasis lokasi GPS, pengajuan izin/cuti, pengajuan lembur, pengajuan dinas luar kantor, serta proses persetujuan (approval) secara terintegrasi.</w:t>
+        <w:t>Buku panduan ini merupakan acuan operasional resmi dalam menggunakan Aplikasi Karyawan Sinarta MJS. Aplikasi ini mencakup seluruh ekosistem kerja SDM, mulai dari pencatatan kehadiran presensi online berbasis koordinat geolokasi (GPS), permohonan izin/cuti, pengajuan lembur, penugasan perjalanan dinas, modul persetujuan (approval) atasan, hingga pengelolaan penggajian (payroll) dan pencetakan slip gaji digital.</w:t>
       </w:r>
     </w:p>
     <w:p>
@@ -83,7 +83,7 @@
           <w:rFonts w:ascii="Arial" w:hAnsi="Arial"/>
           <w:b/>
           <w:color w:val="A3082F"/>
-          <w:sz w:val="26"/>
+          <w:sz w:val="25"/>
         </w:rPr>
         <w:t>1.1 Peran dan Hak Akses Pengguna</w:t>
       </w:r>
@@ -112,9 +112,6 @@
             </w:tcMar>
           </w:tcPr>
           <w:p>
-            <w:pPr>
-              <w:jc w:val="left"/>
-            </w:pPr>
             <w:r>
               <w:rPr>
                 <w:rFonts w:ascii="Arial" w:hAnsi="Arial"/>
@@ -138,9 +135,6 @@
             </w:tcMar>
           </w:tcPr>
           <w:p>
-            <w:pPr>
-              <w:jc w:val="left"/>
-            </w:pPr>
             <w:r>
               <w:rPr>
                 <w:rFonts w:ascii="Arial" w:hAnsi="Arial"/>
@@ -148,7 +142,7 @@
                 <w:color w:val="FFFFFF"/>
                 <w:sz w:val="20"/>
               </w:rPr>
-              <w:t>Pengguna</w:t>
+              <w:t>Pengguna Sasaran</w:t>
             </w:r>
           </w:p>
         </w:tc>
@@ -164,9 +158,6 @@
             </w:tcMar>
           </w:tcPr>
           <w:p>
-            <w:pPr>
-              <w:jc w:val="left"/>
-            </w:pPr>
             <w:r>
               <w:rPr>
                 <w:rFonts w:ascii="Arial" w:hAnsi="Arial"/>
@@ -174,7 +165,7 @@
                 <w:color w:val="FFFFFF"/>
                 <w:sz w:val="20"/>
               </w:rPr>
-              <w:t>Hak Akses Utama</w:t>
+              <w:t>Hak Akses &amp; Cakupan Fitur</w:t>
             </w:r>
           </w:p>
         </w:tc>
@@ -220,7 +211,7 @@
                 <w:color w:val="374151"/>
                 <w:sz w:val="19"/>
               </w:rPr>
-              <w:t>Seluruh Staf / Karyawan</w:t>
+              <w:t>Seluruh Staf Operasional / Karyawan</w:t>
             </w:r>
           </w:p>
         </w:tc>
@@ -242,7 +233,13 @@
                 <w:color w:val="374151"/>
                 <w:sz w:val="19"/>
               </w:rPr>
-              <w:t>Check-in &amp; Check-out absensi lokasi GPS, pengajuan Izin/Cuti, Pengajuan Lembur, Pengajuan Dinas Luar, serta melihat riwayat pengajuan mandiri.</w:t>
+              <w:t>• Presensi Check-in &amp; Check-out berbasis koordinat GPS &amp; tautan Google Maps.</w:t>
+              <w:br/>
+              <w:t>• Pengajuan Izin/Cuti, Lembur, dan Perjalanan Dinas Luar Kantor.</w:t>
+              <w:br/>
+              <w:t>• Memantau status pengajuan pribadi (Pending, Disetujui, Ditolak).</w:t>
+              <w:br/>
+              <w:t>• Mengakses menu 'Slip Gaji Saya', melihat rincian gaji, dan mencetak slip gaji resmi.</w:t>
             </w:r>
           </w:p>
         </w:tc>
@@ -266,7 +263,7 @@
                 <w:color w:val="374151"/>
                 <w:sz w:val="19"/>
               </w:rPr>
-              <w:t>Atasan (Manager / Supervisor)</w:t>
+              <w:t>Atasan</w:t>
             </w:r>
           </w:p>
         </w:tc>
@@ -288,7 +285,7 @@
                 <w:color w:val="374151"/>
                 <w:sz w:val="19"/>
               </w:rPr>
-              <w:t>Kepala Divisi / Team Lead</w:t>
+              <w:t>Manajer, Supervisor, &amp; Pimpinan Divisi</w:t>
             </w:r>
           </w:p>
         </w:tc>
@@ -310,7 +307,15 @@
                 <w:color w:val="374151"/>
                 <w:sz w:val="19"/>
               </w:rPr>
-              <w:t>Memiliki seluruh akses Karyawan + Dashboard Approval untuk mereview, menyetujui (Approve), atau menolak (Reject) pengajuan tim bawahan, serta melihat rekap absensi tim.</w:t>
+              <w:t>• Seluruh akses Karyawan.</w:t>
+              <w:br/>
+              <w:t>• Dashboard Approval: Menyetujui (Approve) atau Menolak (Reject) pengajuan Izin, Lembur, dan Dinas bawahan.</w:t>
+              <w:br/>
+              <w:t>• Rekap Presensi Tim: Memantau kehadiran, jam kerja, dan titik lokasi seluruh tim bawahan.</w:t>
+              <w:br/>
+              <w:t>• Laporan Visualisasi Presensi: Statistik disiplin, keterlambatan, dan performa tim.</w:t>
+              <w:br/>
+              <w:t>• Modul Manajemen Penggajian (Payroll): Konfigurasi tarif global, input gaji pokok karyawan, generate massal slip gaji bulanan, dan publikasi slip gaji.</w:t>
             </w:r>
           </w:p>
         </w:tc>
@@ -334,7 +339,7 @@
                 <w:color w:val="374151"/>
                 <w:sz w:val="19"/>
               </w:rPr>
-              <w:t>Admin HRD / System Admin</w:t>
+              <w:t>Admin</w:t>
             </w:r>
           </w:p>
         </w:tc>
@@ -356,7 +361,7 @@
                 <w:color w:val="374151"/>
                 <w:sz w:val="19"/>
               </w:rPr>
-              <w:t>Administrator &amp; HRD</w:t>
+              <w:t>Administrator Sistem &amp; Divisi HRD</w:t>
             </w:r>
           </w:p>
         </w:tc>
@@ -378,7 +383,11 @@
                 <w:color w:val="374151"/>
                 <w:sz w:val="19"/>
               </w:rPr>
-              <w:t>Kelola penuh sistem, manajemen akun pengguna, atur struktur atasan-bawahan, rekapitulasi laporan absensi keseluruhan, dan cetak/export laporan.</w:t>
+              <w:t>• Akses pengelolaan absensi dan pengajuan tim secara menyeluruh.</w:t>
+              <w:br/>
+              <w:t>• Akses ke halaman approval, rekap absensi, dan laporan visualisasi performa seluruh staf.</w:t>
+              <w:br/>
+              <w:t>• Terdaftar dalam sistem presensi dan laporan statistik tim.</w:t>
             </w:r>
           </w:p>
         </w:tc>
@@ -386,8 +395,15 @@
     </w:tbl>
     <w:p>
       <w:pPr>
-        <w:spacing w:before="80" w:after="80"/>
+        <w:spacing w:before="0" w:after="80" w:line="276" w:lineRule="auto"/>
       </w:pPr>
+      <w:r>
+        <w:rPr>
+          <w:rFonts w:ascii="Arial" w:hAnsi="Arial"/>
+          <w:color w:val="374151"/>
+          <w:sz w:val="20"/>
+        </w:rPr>
+      </w:r>
     </w:p>
     <w:p>
       <w:pPr>
@@ -399,9 +415,9 @@
           <w:rFonts w:ascii="Arial" w:hAnsi="Arial"/>
           <w:b/>
           <w:color w:val="A3082F"/>
-          <w:sz w:val="26"/>
+          <w:sz w:val="25"/>
         </w:rPr>
-        <w:t>1.2 Persyaratan Perangkat &amp; Browser</w:t>
+        <w:t>1.2 Kebutuhan Perangkat &amp; Izin Akses GPS</w:t>
       </w:r>
     </w:p>
     <w:p>
@@ -414,7 +430,7 @@
           <w:rFonts w:ascii="Arial" w:hAnsi="Arial"/>
           <w:b/>
           <w:color w:val="1F2937"/>
-          <w:sz w:val="21"/>
+          <w:sz w:val="20"/>
         </w:rPr>
         <w:t xml:space="preserve">Perangkat: </w:t>
       </w:r>
@@ -422,9 +438,9 @@
         <w:rPr>
           <w:rFonts w:ascii="Arial" w:hAnsi="Arial"/>
           <w:color w:val="374151"/>
-          <w:sz w:val="21"/>
+          <w:sz w:val="20"/>
         </w:rPr>
-        <w:t xml:space="preserve"> Smartphone (Android / iOS) atau Laptop / PC dengan koneksi internet aktif.</w:t>
+        <w:t xml:space="preserve"> Smartphone (Android / iOS) atau Laptop / Komputer dengan koneksi internet aktif.</w:t>
       </w:r>
     </w:p>
     <w:p>
@@ -437,7 +453,7 @@
           <w:rFonts w:ascii="Arial" w:hAnsi="Arial"/>
           <w:b/>
           <w:color w:val="1F2937"/>
-          <w:sz w:val="21"/>
+          <w:sz w:val="20"/>
         </w:rPr>
         <w:t xml:space="preserve">Peramban (Browser): </w:t>
       </w:r>
@@ -445,7 +461,7 @@
         <w:rPr>
           <w:rFonts w:ascii="Arial" w:hAnsi="Arial"/>
           <w:color w:val="374151"/>
-          <w:sz w:val="21"/>
+          <w:sz w:val="20"/>
         </w:rPr>
         <w:t xml:space="preserve"> Google Chrome, Mozilla Firefox, Microsoft Edge, atau Safari versi terbaru.</w:t>
       </w:r>
@@ -460,17 +476,17 @@
           <w:rFonts w:ascii="Arial" w:hAnsi="Arial"/>
           <w:b/>
           <w:color w:val="1F2937"/>
-          <w:sz w:val="21"/>
+          <w:sz w:val="20"/>
         </w:rPr>
-        <w:t xml:space="preserve">Izin Akses Lokasi: </w:t>
+        <w:t xml:space="preserve">Izin Lokasi (Wajib): </w:t>
       </w:r>
       <w:r>
         <w:rPr>
           <w:rFonts w:ascii="Arial" w:hAnsi="Arial"/>
           <w:color w:val="374151"/>
-          <w:sz w:val="21"/>
+          <w:sz w:val="20"/>
         </w:rPr>
-        <w:t xml:space="preserve"> Pengguna Wajib mengaktifkan izin GPS / Geolokasi (Location Access) pada browser agar sistem dapat mencatat titik koordinat absensi.</w:t>
+        <w:t xml:space="preserve"> Pengguna wajib mengizinkan peramban mengakses lokasi (Location Permission / GPS) saat tombol Check-in ditekan.</w:t>
       </w:r>
     </w:p>
     <w:tbl>
@@ -520,7 +536,7 @@
                 <w:color w:val="374151"/>
                 <w:sz w:val="19"/>
               </w:rPr>
-              <w:t>Pastikan Anda memilih 'Allow' atau 'Izinkan' saat browser meminta akses lokasi (Location Access) saat melakukan absensi. Tanpa izin lokasi, tombol Absen Masuk / Keluar tidak dapat memproses data koordinat Anda.</w:t>
+              <w:t>Saat pertama kali mengakses tombol 'Absen Masuk' atau 'Absen Keluar', peramban web akan menampilkan jendela izin lokasi: pilih 'Allow' atau 'Izinkan Saat Menggunakan'. Tanpa izin GPS, presensi tidak dapat direkam oleh sistem keamanan.</w:t>
             </w:r>
           </w:p>
         </w:tc>
@@ -541,7 +557,7 @@
           <w:rFonts w:ascii="Arial" w:hAnsi="Arial"/>
           <w:b/>
           <w:color w:val="800020"/>
-          <w:sz w:val="32"/>
+          <w:sz w:val="30"/>
         </w:rPr>
         <w:t>2. PANDUAN PENGGUNA — MODUL KARYAWAN</w:t>
       </w:r>
@@ -556,9 +572,9 @@
           <w:rFonts w:ascii="Arial" w:hAnsi="Arial"/>
           <w:b/>
           <w:color w:val="A3082F"/>
-          <w:sz w:val="26"/>
+          <w:sz w:val="25"/>
         </w:rPr>
-        <w:t>2.1 Autentikasi (Login &amp; Logout)</w:t>
+        <w:t>2.1 Autentikasi (Login &amp; Logout) &amp; Alur Masuk Otomatis</w:t>
       </w:r>
     </w:p>
     <w:p>
@@ -571,17 +587,17 @@
           <w:rFonts w:ascii="Arial" w:hAnsi="Arial"/>
           <w:b/>
           <w:color w:val="1F2937"/>
-          <w:sz w:val="21"/>
+          <w:sz w:val="20"/>
         </w:rPr>
-        <w:t xml:space="preserve">1. Masuk Alamat URL: </w:t>
+        <w:t xml:space="preserve">1. Buka Aplikasi: </w:t>
       </w:r>
       <w:r>
         <w:rPr>
           <w:rFonts w:ascii="Arial" w:hAnsi="Arial"/>
           <w:color w:val="374151"/>
-          <w:sz w:val="21"/>
+          <w:sz w:val="20"/>
         </w:rPr>
-        <w:t xml:space="preserve"> Buka browser Anda dan akses URL alamat aplikasi karyawan.</w:t>
+        <w:t xml:space="preserve"> Buka peramban web dan kunjungi tautan aplikasi karyawan.</w:t>
       </w:r>
     </w:p>
     <w:p>
@@ -594,17 +610,17 @@
           <w:rFonts w:ascii="Arial" w:hAnsi="Arial"/>
           <w:b/>
           <w:color w:val="1F2937"/>
-          <w:sz w:val="21"/>
+          <w:sz w:val="20"/>
         </w:rPr>
-        <w:t xml:space="preserve">2. Form Login: </w:t>
+        <w:t xml:space="preserve">2. Masukkan Kredensial: </w:t>
       </w:r>
       <w:r>
         <w:rPr>
           <w:rFonts w:ascii="Arial" w:hAnsi="Arial"/>
           <w:color w:val="374151"/>
-          <w:sz w:val="21"/>
+          <w:sz w:val="20"/>
         </w:rPr>
-        <w:t xml:space="preserve"> Masukkan Email terdaftar dan Password akun Anda pada form Login.</w:t>
+        <w:t xml:space="preserve"> Masukkan Email terdaftar dan Kata Sandi (Password) Anda, lalu klik tombol Masuk.</w:t>
       </w:r>
     </w:p>
     <w:p>
@@ -617,17 +633,17 @@
           <w:rFonts w:ascii="Arial" w:hAnsi="Arial"/>
           <w:b/>
           <w:color w:val="1F2937"/>
-          <w:sz w:val="21"/>
+          <w:sz w:val="20"/>
         </w:rPr>
-        <w:t xml:space="preserve">3. Berhasil Masuk: </w:t>
+        <w:t xml:space="preserve">3. Redirect Otomatis: </w:t>
       </w:r>
       <w:r>
         <w:rPr>
           <w:rFonts w:ascii="Arial" w:hAnsi="Arial"/>
           <w:color w:val="374151"/>
-          <w:sz w:val="21"/>
+          <w:sz w:val="20"/>
         </w:rPr>
-        <w:t xml:space="preserve"> Klik tombol Login. Sistem akan mengarahkan Karyawan ke halaman Absensi Utama, atau Atasan ke Halaman Approval.</w:t>
+        <w:t xml:space="preserve"> Sistem cerdas secara otomatis mengarahkan Karyawan ke halaman Absensi Mandiri, dan mengarahkan Atasan langsung ke Dashboard Approval.</w:t>
       </w:r>
     </w:p>
     <w:p>
@@ -640,17 +656,17 @@
           <w:rFonts w:ascii="Arial" w:hAnsi="Arial"/>
           <w:b/>
           <w:color w:val="1F2937"/>
-          <w:sz w:val="21"/>
+          <w:sz w:val="20"/>
         </w:rPr>
-        <w:t xml:space="preserve">4. Keluar (Logout): </w:t>
+        <w:t xml:space="preserve">4. Keluar Sistem: </w:t>
       </w:r>
       <w:r>
         <w:rPr>
           <w:rFonts w:ascii="Arial" w:hAnsi="Arial"/>
           <w:color w:val="374151"/>
-          <w:sz w:val="21"/>
+          <w:sz w:val="20"/>
         </w:rPr>
-        <w:t xml:space="preserve"> Untuk keluar dari sistem, klik menu nama profil di sudut kanan atas lalu pilih 'Log Out'.</w:t>
+        <w:t xml:space="preserve"> Untuk mengakhiri sesi kerja, klik nama profil di bilah navigasi kanan atas lalu pilih 'Keluar' (Log Out).</w:t>
       </w:r>
     </w:p>
     <w:p>
@@ -663,22 +679,9 @@
           <w:rFonts w:ascii="Arial" w:hAnsi="Arial"/>
           <w:b/>
           <w:color w:val="A3082F"/>
-          <w:sz w:val="26"/>
+          <w:sz w:val="25"/>
         </w:rPr>
-        <w:t>2.2 Melakukan Absensi Harian (Check-in &amp; Check-out)</w:t>
-      </w:r>
-    </w:p>
-    <w:p>
-      <w:pPr>
-        <w:spacing w:before="0" w:after="80" w:line="276" w:lineRule="auto"/>
-      </w:pPr>
-      <w:r>
-        <w:rPr>
-          <w:rFonts w:ascii="Arial" w:hAnsi="Arial"/>
-          <w:color w:val="374151"/>
-          <w:sz w:val="21"/>
-        </w:rPr>
-        <w:t>Fitur absensi digunakan untuk mencatat kehadiran harian karyawan secara realtime beserta titik lokasi koordinat Google Maps.</w:t>
+        <w:t>2.2 Melakukan Presensi Harian (Check-in &amp; Check-out)</w:t>
       </w:r>
     </w:p>
     <w:p>
@@ -691,17 +694,17 @@
           <w:rFonts w:ascii="Arial" w:hAnsi="Arial"/>
           <w:b/>
           <w:color w:val="1F2937"/>
-          <w:sz w:val="21"/>
+          <w:sz w:val="20"/>
         </w:rPr>
-        <w:t xml:space="preserve">Langkah 1: </w:t>
+        <w:t xml:space="preserve">Langkah 1 (Buka Menu): </w:t>
       </w:r>
       <w:r>
         <w:rPr>
           <w:rFonts w:ascii="Arial" w:hAnsi="Arial"/>
           <w:color w:val="374151"/>
-          <w:sz w:val="21"/>
+          <w:sz w:val="20"/>
         </w:rPr>
-        <w:t xml:space="preserve"> Masuk ke menu 'Absensi'. Halaman akan menampilkan status absensi hari ini.</w:t>
+        <w:t xml:space="preserve"> Masuk ke menu 'Absensi' pada navigasi utama.</w:t>
       </w:r>
     </w:p>
     <w:p>
@@ -714,7 +717,7 @@
           <w:rFonts w:ascii="Arial" w:hAnsi="Arial"/>
           <w:b/>
           <w:color w:val="1F2937"/>
-          <w:sz w:val="21"/>
+          <w:sz w:val="20"/>
         </w:rPr>
         <w:t xml:space="preserve">Langkah 2 (Absen Masuk): </w:t>
       </w:r>
@@ -722,9 +725,9 @@
         <w:rPr>
           <w:rFonts w:ascii="Arial" w:hAnsi="Arial"/>
           <w:color w:val="374151"/>
-          <w:sz w:val="21"/>
+          <w:sz w:val="20"/>
         </w:rPr>
-        <w:t xml:space="preserve"> Apabila Anda belum absen masuk, klik tombol 'Absen Masuk' (tombol berwarna Maroon).</w:t>
+        <w:t xml:space="preserve"> Untuk memulai jam kerja harian, klik tombol 'Absen Masuk'. Pastikan posisi GPS terdeteksi.</w:t>
       </w:r>
     </w:p>
     <w:p>
@@ -737,17 +740,17 @@
           <w:rFonts w:ascii="Arial" w:hAnsi="Arial"/>
           <w:b/>
           <w:color w:val="1F2937"/>
-          <w:sz w:val="21"/>
+          <w:sz w:val="20"/>
         </w:rPr>
-        <w:t xml:space="preserve">Langkah 3 (Verifikasi Lokasi): </w:t>
+        <w:t xml:space="preserve">Langkah 3 (Penentuan Status): </w:t>
       </w:r>
       <w:r>
         <w:rPr>
           <w:rFonts w:ascii="Arial" w:hAnsi="Arial"/>
           <w:color w:val="374151"/>
-          <w:sz w:val="21"/>
+          <w:sz w:val="20"/>
         </w:rPr>
-        <w:t xml:space="preserve"> Browser akan meminta koordinat GPS Anda secara otomatis. Tunggu beberapa detik hingga proses pencatatan selesai.</w:t>
+        <w:t xml:space="preserve"> Sistem memvalidasi waktu masuk: kehadiran sebelum atau tepat pukul 08:00 WIB berstatus 'Hadir' (Hijau), sedangkan kehadiran setelah pukul 08:00 WIB berstatus 'Telat' (Kuning).</w:t>
       </w:r>
     </w:p>
     <w:p>
@@ -760,17 +763,17 @@
           <w:rFonts w:ascii="Arial" w:hAnsi="Arial"/>
           <w:b/>
           <w:color w:val="1F2937"/>
-          <w:sz w:val="21"/>
+          <w:sz w:val="20"/>
         </w:rPr>
-        <w:t xml:space="preserve">Langkah 4: </w:t>
+        <w:t xml:space="preserve">Langkah 4 (Absen Keluar): </w:t>
       </w:r>
       <w:r>
         <w:rPr>
           <w:rFonts w:ascii="Arial" w:hAnsi="Arial"/>
           <w:color w:val="374151"/>
-          <w:sz w:val="21"/>
+          <w:sz w:val="20"/>
         </w:rPr>
-        <w:t xml:space="preserve"> Setelah berhasil, waktu masuk akan terบันทึก (tercatat) dan status absensi akan berubah (misal: 'Hadir' atau 'Telat').</w:t>
+        <w:t xml:space="preserve"> Pada akhir jam kerja kantor, klik tombol 'Absen Keluar' untuk mencatat jam pulang.</w:t>
       </w:r>
     </w:p>
     <w:p>
@@ -783,17 +786,45 @@
           <w:rFonts w:ascii="Arial" w:hAnsi="Arial"/>
           <w:b/>
           <w:color w:val="1F2937"/>
-          <w:sz w:val="21"/>
+          <w:sz w:val="20"/>
         </w:rPr>
-        <w:t xml:space="preserve">Langkah 5 (Absen Keluar): </w:t>
+        <w:t xml:space="preserve">Langkah 5 (Pemeriksaan Riwayat): </w:t>
       </w:r>
       <w:r>
         <w:rPr>
           <w:rFonts w:ascii="Arial" w:hAnsi="Arial"/>
           <w:color w:val="374151"/>
-          <w:sz w:val="21"/>
+          <w:sz w:val="20"/>
         </w:rPr>
-        <w:t xml:space="preserve"> Saat jam kerja berakhir, buka kembali menu 'Absensi' dan klik tombol 'Absen Keluar'.</w:t>
+        <w:t xml:space="preserve"> Pada bagian bawah halaman, periksa tabel 'Riwayat Bulan Ini' untuk meninjau jam kerja harian dan tautan titik peta Google Maps lokasi presensi Anda.</w:t>
+      </w:r>
+    </w:p>
+    <w:p>
+      <w:pPr>
+        <w:keepNext/>
+        <w:spacing w:before="240" w:after="80"/>
+      </w:pPr>
+      <w:r>
+        <w:rPr>
+          <w:rFonts w:ascii="Arial" w:hAnsi="Arial"/>
+          <w:b/>
+          <w:color w:val="A3082F"/>
+          <w:sz w:val="25"/>
+        </w:rPr>
+        <w:t>2.3 Pengajuan Izin / Cuti Online</w:t>
+      </w:r>
+    </w:p>
+    <w:p>
+      <w:pPr>
+        <w:spacing w:before="0" w:after="80" w:line="276" w:lineRule="auto"/>
+      </w:pPr>
+      <w:r>
+        <w:rPr>
+          <w:rFonts w:ascii="Arial" w:hAnsi="Arial"/>
+          <w:color w:val="374151"/>
+          <w:sz w:val="20"/>
+        </w:rPr>
+        <w:t>Digunakan ketika berhalangan hadir atau membutuhkan izin meninggalkan kantor.</w:t>
       </w:r>
     </w:p>
     <w:p>
@@ -806,111 +837,17 @@
           <w:rFonts w:ascii="Arial" w:hAnsi="Arial"/>
           <w:b/>
           <w:color w:val="1F2937"/>
-          <w:sz w:val="21"/>
+          <w:sz w:val="20"/>
         </w:rPr>
-        <w:t xml:space="preserve">Langkah 6 (Riwayat Absensi): </w:t>
+        <w:t xml:space="preserve">1. Navigasi: </w:t>
       </w:r>
       <w:r>
         <w:rPr>
           <w:rFonts w:ascii="Arial" w:hAnsi="Arial"/>
           <w:color w:val="374151"/>
-          <w:sz w:val="21"/>
+          <w:sz w:val="20"/>
         </w:rPr>
-        <w:t xml:space="preserve"> Di bagian bawah halaman Absensi, Anda dapat melihat tabel 'Riwayat Bulan Ini' yang menampilkan tanggal, jam masuk, jam keluar, status (Hadir/Telat/Izin/Alpha), serta tautan 'Lihat Lokasi' pada Google Maps.</w:t>
-      </w:r>
-    </w:p>
-    <w:tbl>
-      <w:tblPr>
-        <w:tblW w:type="auto" w:w="0"/>
-        <w:jc w:val="center"/>
-        <w:tblLook w:firstColumn="1" w:firstRow="1" w:lastColumn="0" w:lastRow="0" w:noHBand="0" w:noVBand="1" w:val="04A0"/>
-      </w:tblPr>
-      <w:tblGrid>
-        <w:gridCol w:w="9360"/>
-      </w:tblGrid>
-      <w:tr>
-        <w:tc>
-          <w:tcPr>
-            <w:tcW w:type="dxa" w:w="9360"/>
-            <w:shd w:fill="F9FAFB"/>
-            <w:tcMar>
-              <w:top w:w="140" w:type="dxa"/>
-              <w:bottom w:w="140" w:type="dxa"/>
-              <w:left w:w="200" w:type="dxa"/>
-              <w:right w:w="200" w:type="dxa"/>
-            </w:tcMar>
-            <w:tcBorders>
-              <w:top w:val="none"/>
-              <w:left w:val="single" w:sz="24" w:space="0" w:color="EAB308"/>
-              <w:bottom w:val="none"/>
-              <w:right w:val="none"/>
-            </w:tcBorders>
-          </w:tcPr>
-          <w:p>
-            <w:pPr>
-              <w:spacing w:before="40" w:after="80"/>
-            </w:pPr>
-            <w:r>
-              <w:rPr>
-                <w:rFonts w:ascii="Arial" w:hAnsi="Arial"/>
-                <w:b/>
-                <w:color w:val="800020"/>
-                <w:sz w:val="20"/>
-              </w:rPr>
-              <w:t>📌 INFORMASI STATUS ABSENSI</w:t>
-              <w:br/>
-            </w:r>
-            <w:r>
-              <w:rPr>
-                <w:rFonts w:ascii="Arial" w:hAnsi="Arial"/>
-                <w:color w:val="374151"/>
-                <w:sz w:val="19"/>
-              </w:rPr>
-              <w:t>Tanda Badge Status Absensi:</w:t>
-              <w:br/>
-              <w:t>• Hijau (Hadir): Absen tepat waktu.</w:t>
-              <w:br/>
-              <w:t>• Kuning (Telat): Absen melewati batas toleransi masuk.</w:t>
-              <w:br/>
-              <w:t>• Biru (Izin): Memiliki izin/dinas yang telah disetujui.</w:t>
-              <w:br/>
-              <w:t>• Merah (Alpha): Tidak ada catatan kehadiran atau izin.</w:t>
-            </w:r>
-          </w:p>
-        </w:tc>
-      </w:tr>
-    </w:tbl>
-    <w:p>
-      <w:pPr>
-        <w:spacing w:before="0" w:after="120"/>
-      </w:pPr>
-    </w:p>
-    <w:p>
-      <w:pPr>
-        <w:keepNext/>
-        <w:spacing w:before="240" w:after="80"/>
-      </w:pPr>
-      <w:r>
-        <w:rPr>
-          <w:rFonts w:ascii="Arial" w:hAnsi="Arial"/>
-          <w:b/>
-          <w:color w:val="A3082F"/>
-          <w:sz w:val="26"/>
-        </w:rPr>
-        <w:t>2.3 Pengajuan Izin / Cuti</w:t>
-      </w:r>
-    </w:p>
-    <w:p>
-      <w:pPr>
-        <w:spacing w:before="0" w:after="80" w:line="276" w:lineRule="auto"/>
-      </w:pPr>
-      <w:r>
-        <w:rPr>
-          <w:rFonts w:ascii="Arial" w:hAnsi="Arial"/>
-          <w:color w:val="374151"/>
-          <w:sz w:val="21"/>
-        </w:rPr>
-        <w:t>Karyawan dapat mengajukan izin tidak masuk kerja, cuti tahunan, sakit, atau alasan penting lainnya secara online.</w:t>
+        <w:t xml:space="preserve"> Klik menu 'Pengajuan' -&gt; pilih 'Izin'.</w:t>
       </w:r>
     </w:p>
     <w:p>
@@ -923,38 +860,15 @@
           <w:rFonts w:ascii="Arial" w:hAnsi="Arial"/>
           <w:b/>
           <w:color w:val="1F2937"/>
-          <w:sz w:val="21"/>
+          <w:sz w:val="20"/>
         </w:rPr>
-        <w:t xml:space="preserve">1. Navigasi: </w:t>
+        <w:t xml:space="preserve">2. Buka Formulir: </w:t>
       </w:r>
       <w:r>
         <w:rPr>
           <w:rFonts w:ascii="Arial" w:hAnsi="Arial"/>
           <w:color w:val="374151"/>
-          <w:sz w:val="21"/>
-        </w:rPr>
-        <w:t xml:space="preserve"> Akses menu 'Pengajuan' -&gt; pilih 'Izin'.</w:t>
-      </w:r>
-    </w:p>
-    <w:p>
-      <w:pPr>
-        <w:pStyle w:val="ListBullet"/>
-        <w:spacing w:before="0" w:after="60" w:line="276" w:lineRule="auto"/>
-      </w:pPr>
-      <w:r>
-        <w:rPr>
-          <w:rFonts w:ascii="Arial" w:hAnsi="Arial"/>
-          <w:b/>
-          <w:color w:val="1F2937"/>
-          <w:sz w:val="21"/>
-        </w:rPr>
-        <w:t xml:space="preserve">2. Buat Form: </w:t>
-      </w:r>
-      <w:r>
-        <w:rPr>
-          <w:rFonts w:ascii="Arial" w:hAnsi="Arial"/>
-          <w:color w:val="374151"/>
-          <w:sz w:val="21"/>
+          <w:sz w:val="20"/>
         </w:rPr>
         <w:t xml:space="preserve"> Klik tombol '+ Buat Pengajuan Izin'.</w:t>
       </w:r>
@@ -969,17 +883,17 @@
           <w:rFonts w:ascii="Arial" w:hAnsi="Arial"/>
           <w:b/>
           <w:color w:val="1F2937"/>
-          <w:sz w:val="21"/>
+          <w:sz w:val="20"/>
         </w:rPr>
-        <w:t xml:space="preserve">3. Pengisian Data: </w:t>
+        <w:t xml:space="preserve">3. Pilih Kategori: </w:t>
       </w:r>
       <w:r>
         <w:rPr>
           <w:rFonts w:ascii="Arial" w:hAnsi="Arial"/>
           <w:color w:val="374151"/>
-          <w:sz w:val="21"/>
+          <w:sz w:val="20"/>
         </w:rPr>
-        <w:t xml:space="preserve"> Isi Jenis Izin (Cuti, Sakit, Alasan Penting), Tanggal Mulai, Tanggal Selesai, serta Alasan/Keterangan lengkap.</w:t>
+        <w:t xml:space="preserve"> Tentukan Jenis Izin yang sesuai: 'Tidak Masuk Kerja', 'Datang Terlambat', 'Pulang Lebih Awal', atau 'Keluar Kantor Sementara'.</w:t>
       </w:r>
     </w:p>
     <w:p>
@@ -992,17 +906,40 @@
           <w:rFonts w:ascii="Arial" w:hAnsi="Arial"/>
           <w:b/>
           <w:color w:val="1F2937"/>
-          <w:sz w:val="21"/>
+          <w:sz w:val="20"/>
         </w:rPr>
-        <w:t xml:space="preserve">4. Kirim: </w:t>
+        <w:t xml:space="preserve">4. Rincian Izin: </w:t>
       </w:r>
       <w:r>
         <w:rPr>
           <w:rFonts w:ascii="Arial" w:hAnsi="Arial"/>
           <w:color w:val="374151"/>
-          <w:sz w:val="21"/>
+          <w:sz w:val="20"/>
         </w:rPr>
-        <w:t xml:space="preserve"> Klik tombol 'Kirim Pengajuan'. Status pengajuan akan menjadi 'Pending' dan otomatis terkirim ke Atasan Anda untuk direview.</w:t>
+        <w:t xml:space="preserve"> Isi Tanggal Mulai, Tanggal Selesai (jika izin berhari-hari), durasi/jam, serta uraian alasan izin yang jelas.</w:t>
+      </w:r>
+    </w:p>
+    <w:p>
+      <w:pPr>
+        <w:pStyle w:val="ListBullet"/>
+        <w:spacing w:before="0" w:after="60" w:line="276" w:lineRule="auto"/>
+      </w:pPr>
+      <w:r>
+        <w:rPr>
+          <w:rFonts w:ascii="Arial" w:hAnsi="Arial"/>
+          <w:b/>
+          <w:color w:val="1F2937"/>
+          <w:sz w:val="20"/>
+        </w:rPr>
+        <w:t xml:space="preserve">5. Kirim: </w:t>
+      </w:r>
+      <w:r>
+        <w:rPr>
+          <w:rFonts w:ascii="Arial" w:hAnsi="Arial"/>
+          <w:color w:val="374151"/>
+          <w:sz w:val="20"/>
+        </w:rPr>
+        <w:t xml:space="preserve"> Klik 'Kirim Pengajuan'. Berkas pengajuan akan terkirim dengan status 'Pending' untuk diverifikasi atasan langsung.</w:t>
       </w:r>
     </w:p>
     <w:p>
@@ -1015,7 +952,7 @@
           <w:rFonts w:ascii="Arial" w:hAnsi="Arial"/>
           <w:b/>
           <w:color w:val="A3082F"/>
-          <w:sz w:val="26"/>
+          <w:sz w:val="25"/>
         </w:rPr>
         <w:t>2.4 Pengajuan Lembur</w:t>
       </w:r>
@@ -1028,9 +965,9 @@
         <w:rPr>
           <w:rFonts w:ascii="Arial" w:hAnsi="Arial"/>
           <w:color w:val="374151"/>
-          <w:sz w:val="21"/>
+          <w:sz w:val="20"/>
         </w:rPr>
-        <w:t>Digunakan ketika Karyawan melaksanakan tugas tambahan di luar jam kerja efektif.</w:t>
+        <w:t>Wajib diajukan oleh staf yang melaksanakan tugas lembur di luar jam kerja efektif agar kompensasi lembur dapat terhitung di slip gaji.</w:t>
       </w:r>
     </w:p>
     <w:p>
@@ -1043,17 +980,17 @@
           <w:rFonts w:ascii="Arial" w:hAnsi="Arial"/>
           <w:b/>
           <w:color w:val="1F2937"/>
-          <w:sz w:val="21"/>
+          <w:sz w:val="20"/>
         </w:rPr>
-        <w:t xml:space="preserve">1. Navigasi: </w:t>
+        <w:t xml:space="preserve">1. Navigasi &amp; Form: </w:t>
       </w:r>
       <w:r>
         <w:rPr>
           <w:rFonts w:ascii="Arial" w:hAnsi="Arial"/>
           <w:color w:val="374151"/>
-          <w:sz w:val="21"/>
+          <w:sz w:val="20"/>
         </w:rPr>
-        <w:t xml:space="preserve"> Akses menu 'Pengajuan' -&gt; pilih 'Lembur'.</w:t>
+        <w:t xml:space="preserve"> Klik menu 'Pengajuan' -&gt; pilih 'Lembur', lalu tekan tombol '+ Ajukan Lembur'.</w:t>
       </w:r>
     </w:p>
     <w:p>
@@ -1066,17 +1003,17 @@
           <w:rFonts w:ascii="Arial" w:hAnsi="Arial"/>
           <w:b/>
           <w:color w:val="1F2937"/>
-          <w:sz w:val="21"/>
+          <w:sz w:val="20"/>
         </w:rPr>
-        <w:t xml:space="preserve">2. Buat Form: </w:t>
+        <w:t xml:space="preserve">2. Pengisian Form: </w:t>
       </w:r>
       <w:r>
         <w:rPr>
           <w:rFonts w:ascii="Arial" w:hAnsi="Arial"/>
           <w:color w:val="374151"/>
-          <w:sz w:val="21"/>
+          <w:sz w:val="20"/>
         </w:rPr>
-        <w:t xml:space="preserve"> Klik tombol '+ Buat Pengajuan Lembur'.</w:t>
+        <w:t xml:space="preserve"> Tentukan Tanggal Lembur, Jam Mulai, Jam Selesai, Lokasi Lembur (misal: Kantor Pusat / Lapangan), dan uraian pekerjaan yang dikerjakan.</w:t>
       </w:r>
     </w:p>
     <w:p>
@@ -1089,17 +1026,45 @@
           <w:rFonts w:ascii="Arial" w:hAnsi="Arial"/>
           <w:b/>
           <w:color w:val="1F2937"/>
-          <w:sz w:val="21"/>
+          <w:sz w:val="20"/>
         </w:rPr>
-        <w:t xml:space="preserve">3. Form Lembur: </w:t>
+        <w:t xml:space="preserve">3. Integrasi Penggajian: </w:t>
       </w:r>
       <w:r>
         <w:rPr>
           <w:rFonts w:ascii="Arial" w:hAnsi="Arial"/>
           <w:color w:val="374151"/>
-          <w:sz w:val="21"/>
+          <w:sz w:val="20"/>
         </w:rPr>
-        <w:t xml:space="preserve"> Tentukan Tanggal Lembur, Jam Mulai, Jam Selesai, dan Deskripsi Pekerjaan yang dikerjakan.</w:t>
+        <w:t xml:space="preserve"> Klik 'Kirim Pengajuan Lembur'. Setelah disetujui oleh Atasan (Approved), total durasi jam lembur otomatis terakumulasi ke dalam perhitungan slip gaji bulanan Anda.</w:t>
+      </w:r>
+    </w:p>
+    <w:p>
+      <w:pPr>
+        <w:keepNext/>
+        <w:spacing w:before="240" w:after="80"/>
+      </w:pPr>
+      <w:r>
+        <w:rPr>
+          <w:rFonts w:ascii="Arial" w:hAnsi="Arial"/>
+          <w:b/>
+          <w:color w:val="A3082F"/>
+          <w:sz w:val="25"/>
+        </w:rPr>
+        <w:t>2.5 Pengajuan Perjalanan Dinas Luar Kantor</w:t>
+      </w:r>
+    </w:p>
+    <w:p>
+      <w:pPr>
+        <w:spacing w:before="0" w:after="80" w:line="276" w:lineRule="auto"/>
+      </w:pPr>
+      <w:r>
+        <w:rPr>
+          <w:rFonts w:ascii="Arial" w:hAnsi="Arial"/>
+          <w:color w:val="374151"/>
+          <w:sz w:val="20"/>
+        </w:rPr>
+        <w:t>Digunakan saat staf ditugaskan melakukan perjalanan dinas atau kunjungan luar kantor.</w:t>
       </w:r>
     </w:p>
     <w:p>
@@ -1112,17 +1077,63 @@
           <w:rFonts w:ascii="Arial" w:hAnsi="Arial"/>
           <w:b/>
           <w:color w:val="1F2937"/>
-          <w:sz w:val="21"/>
+          <w:sz w:val="20"/>
         </w:rPr>
-        <w:t xml:space="preserve">4. Simpan: </w:t>
+        <w:t xml:space="preserve">1. Navigasi &amp; Form: </w:t>
       </w:r>
       <w:r>
         <w:rPr>
           <w:rFonts w:ascii="Arial" w:hAnsi="Arial"/>
           <w:color w:val="374151"/>
-          <w:sz w:val="21"/>
+          <w:sz w:val="20"/>
         </w:rPr>
-        <w:t xml:space="preserve"> Simpan pengajuan dan pantau status persetujuan dari Atasan pada tabel Riwayat Lembur.</w:t>
+        <w:t xml:space="preserve"> Klik menu 'Pengajuan' -&gt; pilih 'Dinas Luar' -&gt; klik '+ Ajukan Dinas Luar'.</w:t>
+      </w:r>
+    </w:p>
+    <w:p>
+      <w:pPr>
+        <w:pStyle w:val="ListBullet"/>
+        <w:spacing w:before="0" w:after="60" w:line="276" w:lineRule="auto"/>
+      </w:pPr>
+      <w:r>
+        <w:rPr>
+          <w:rFonts w:ascii="Arial" w:hAnsi="Arial"/>
+          <w:b/>
+          <w:color w:val="1F2937"/>
+          <w:sz w:val="20"/>
+        </w:rPr>
+        <w:t xml:space="preserve">2. Kelengkapan Data: </w:t>
+      </w:r>
+      <w:r>
+        <w:rPr>
+          <w:rFonts w:ascii="Arial" w:hAnsi="Arial"/>
+          <w:color w:val="374151"/>
+          <w:sz w:val="20"/>
+        </w:rPr>
+        <w:t xml:space="preserve"> Tentukan Tanggal Dinas, Alamat/Tujuan Dinas, Jam Keluar, Jam Kembali, Alat Transportasi (Kendaraan Dinas, Pribadi, atau Umum), serta maksud penugasan.</w:t>
+      </w:r>
+    </w:p>
+    <w:p>
+      <w:pPr>
+        <w:pStyle w:val="ListBullet"/>
+        <w:spacing w:before="0" w:after="60" w:line="276" w:lineRule="auto"/>
+      </w:pPr>
+      <w:r>
+        <w:rPr>
+          <w:rFonts w:ascii="Arial" w:hAnsi="Arial"/>
+          <w:b/>
+          <w:color w:val="1F2937"/>
+          <w:sz w:val="20"/>
+        </w:rPr>
+        <w:t xml:space="preserve">3. Status &amp; Tunjangan: </w:t>
+      </w:r>
+      <w:r>
+        <w:rPr>
+          <w:rFonts w:ascii="Arial" w:hAnsi="Arial"/>
+          <w:color w:val="374151"/>
+          <w:sz w:val="20"/>
+        </w:rPr>
+        <w:t xml:space="preserve"> Kirim pengajuan. Pengajuan dinas yang disetujui (Approved) akan otomatis diperhitungkan sebagai kehadiran kerja sah dan menambah tunjangan dinas pada slip gaji.</w:t>
       </w:r>
     </w:p>
     <w:p>
@@ -1135,9 +1146,9 @@
           <w:rFonts w:ascii="Arial" w:hAnsi="Arial"/>
           <w:b/>
           <w:color w:val="A3082F"/>
-          <w:sz w:val="26"/>
+          <w:sz w:val="25"/>
         </w:rPr>
-        <w:t>2.5 Pengajuan Dinas Luar Kantor</w:t>
+        <w:t>2.6 Mengakses &amp; Mencetak 'Slip Gaji Saya'</w:t>
       </w:r>
     </w:p>
     <w:p>
@@ -1148,9 +1159,9 @@
         <w:rPr>
           <w:rFonts w:ascii="Arial" w:hAnsi="Arial"/>
           <w:color w:val="374151"/>
-          <w:sz w:val="21"/>
+          <w:sz w:val="20"/>
         </w:rPr>
-        <w:t>Digunakan bagi Karyawan yang mendapatkan tugas perjalanan dinas atau kunjungan kerja di luar lokasi kantor utama.</w:t>
+        <w:t>Setiap staf dapat memeriksa dokumen penerimaan gaji resmi secara transparan setelah slip gaji diterbitkan oleh Atasan/Manajemen.</w:t>
       </w:r>
     </w:p>
     <w:p>
@@ -1163,17 +1174,17 @@
           <w:rFonts w:ascii="Arial" w:hAnsi="Arial"/>
           <w:b/>
           <w:color w:val="1F2937"/>
-          <w:sz w:val="21"/>
+          <w:sz w:val="20"/>
         </w:rPr>
-        <w:t xml:space="preserve">1. Navigasi: </w:t>
+        <w:t xml:space="preserve">1. Akses Menu: </w:t>
       </w:r>
       <w:r>
         <w:rPr>
           <w:rFonts w:ascii="Arial" w:hAnsi="Arial"/>
           <w:color w:val="374151"/>
-          <w:sz w:val="21"/>
+          <w:sz w:val="20"/>
         </w:rPr>
-        <w:t xml:space="preserve"> Buka menu 'Pengajuan' -&gt; pilih 'Dinas Luar'.</w:t>
+        <w:t xml:space="preserve"> Klik menu 'Slip Gaji Saya' pada navigasi utama.</w:t>
       </w:r>
     </w:p>
     <w:p>
@@ -1186,17 +1197,17 @@
           <w:rFonts w:ascii="Arial" w:hAnsi="Arial"/>
           <w:b/>
           <w:color w:val="1F2937"/>
-          <w:sz w:val="21"/>
+          <w:sz w:val="20"/>
         </w:rPr>
-        <w:t xml:space="preserve">2. Buat Form: </w:t>
+        <w:t xml:space="preserve">2. Kartu Periode: </w:t>
       </w:r>
       <w:r>
         <w:rPr>
           <w:rFonts w:ascii="Arial" w:hAnsi="Arial"/>
           <w:color w:val="374151"/>
-          <w:sz w:val="21"/>
+          <w:sz w:val="20"/>
         </w:rPr>
-        <w:t xml:space="preserve"> Klik '+ Buat Pengajuan Dinas'.</w:t>
+        <w:t xml:space="preserve"> Halaman menampilkan kartu slip gaji per periode (misal: 2026-09, 2026-10) dengan status 'Terbit'.</w:t>
       </w:r>
     </w:p>
     <w:p>
@@ -1209,17 +1220,17 @@
           <w:rFonts w:ascii="Arial" w:hAnsi="Arial"/>
           <w:b/>
           <w:color w:val="1F2937"/>
-          <w:sz w:val="21"/>
+          <w:sz w:val="20"/>
         </w:rPr>
-        <w:t xml:space="preserve">3. Detail Dinas: </w:t>
+        <w:t xml:space="preserve">3. Rincian Lengkap: </w:t>
       </w:r>
       <w:r>
         <w:rPr>
           <w:rFonts w:ascii="Arial" w:hAnsi="Arial"/>
           <w:color w:val="374151"/>
-          <w:sz w:val="21"/>
+          <w:sz w:val="20"/>
         </w:rPr>
-        <w:t xml:space="preserve"> Masukkan Nama Tugas/Kegiatan, Tanggal Berangkat, Tanggal Kembali, Lokasi Tujuan Dinas, dan Keterangan Tugas.</w:t>
+        <w:t xml:space="preserve"> Klik tombol 'Lihat Detail' untuk membuka modal rincian slip gaji, yang menampilkan: Gaji Pokok, Tambahan Lembur (berdasarkan jam), Tunjangan Dinas, Potongan Alpha/Izin, dan Total Gaji Bersih (Take Home Pay).</w:t>
       </w:r>
     </w:p>
     <w:p>
@@ -1232,17 +1243,17 @@
           <w:rFonts w:ascii="Arial" w:hAnsi="Arial"/>
           <w:b/>
           <w:color w:val="1F2937"/>
-          <w:sz w:val="21"/>
+          <w:sz w:val="20"/>
         </w:rPr>
-        <w:t xml:space="preserve">4. Kirim: </w:t>
+        <w:t xml:space="preserve">4. Cetak Resmi: </w:t>
       </w:r>
       <w:r>
         <w:rPr>
           <w:rFonts w:ascii="Arial" w:hAnsi="Arial"/>
           <w:color w:val="374151"/>
-          <w:sz w:val="21"/>
+          <w:sz w:val="20"/>
         </w:rPr>
-        <w:t xml:space="preserve"> Kirim pengajuan untuk verifikasi Atasan.</w:t>
+        <w:t xml:space="preserve"> Klik tombol 'Cetak Slip' untuk mencetak fisik atau menyimpan dokumen slip gaji resmi ke format PDF via peramban.</w:t>
       </w:r>
     </w:p>
     <w:p>
@@ -1255,7 +1266,7 @@
           <w:rFonts w:ascii="Arial" w:hAnsi="Arial"/>
           <w:b/>
           <w:color w:val="800020"/>
-          <w:sz w:val="32"/>
+          <w:sz w:val="30"/>
         </w:rPr>
         <w:t>3. PANDUAN PENGGUNA — MODUL ATASAN &amp; ADMIN</w:t>
       </w:r>
@@ -1270,9 +1281,9 @@
           <w:rFonts w:ascii="Arial" w:hAnsi="Arial"/>
           <w:b/>
           <w:color w:val="A3082F"/>
-          <w:sz w:val="26"/>
+          <w:sz w:val="25"/>
         </w:rPr>
-        <w:t>3.1 Dashboard Approval (Persetujuan Tim)</w:t>
+        <w:t>3.1 Dashboard Approval (Persetujuan Cepat)</w:t>
       </w:r>
     </w:p>
     <w:p>
@@ -1283,9 +1294,9 @@
         <w:rPr>
           <w:rFonts w:ascii="Arial" w:hAnsi="Arial"/>
           <w:color w:val="374151"/>
-          <w:sz w:val="21"/>
+          <w:sz w:val="20"/>
         </w:rPr>
-        <w:t>Atasan (Manager / Supervisor) memiliki akses ke Dashboard Approval untuk mengelola pengajuan dari seluruh anggota tim bawahan.</w:t>
+        <w:t>Atasan langsung dan Administrator dapat mengelola seluruh pengajuan tim kerja bawahan pada satu pintu terintegrasi.</w:t>
       </w:r>
     </w:p>
     <w:p>
@@ -1298,17 +1309,17 @@
           <w:rFonts w:ascii="Arial" w:hAnsi="Arial"/>
           <w:b/>
           <w:color w:val="1F2937"/>
-          <w:sz w:val="21"/>
+          <w:sz w:val="20"/>
         </w:rPr>
-        <w:t xml:space="preserve">1. Akses Dashboard Approval: </w:t>
+        <w:t xml:space="preserve">1. Akses Dashboard: </w:t>
       </w:r>
       <w:r>
         <w:rPr>
           <w:rFonts w:ascii="Arial" w:hAnsi="Arial"/>
           <w:color w:val="374151"/>
-          <w:sz w:val="21"/>
+          <w:sz w:val="20"/>
         </w:rPr>
-        <w:t xml:space="preserve"> Masuk ke menu 'Approval' dari navigasi utama.</w:t>
+        <w:t xml:space="preserve"> Buka menu 'Approval' pada bilah navigasi.</w:t>
       </w:r>
     </w:p>
     <w:p>
@@ -1321,17 +1332,40 @@
           <w:rFonts w:ascii="Arial" w:hAnsi="Arial"/>
           <w:b/>
           <w:color w:val="1F2937"/>
-          <w:sz w:val="21"/>
+          <w:sz w:val="20"/>
         </w:rPr>
-        <w:t xml:space="preserve">2. Ringkasan Pengajuan: </w:t>
+        <w:t xml:space="preserve">2. Tab Kategori: </w:t>
       </w:r>
       <w:r>
         <w:rPr>
           <w:rFonts w:ascii="Arial" w:hAnsi="Arial"/>
           <w:color w:val="374151"/>
-          <w:sz w:val="21"/>
+          <w:sz w:val="20"/>
         </w:rPr>
-        <w:t xml:space="preserve"> Halaman utama menampilkan kartu statistik pengajuan (Pending Izin, Pending Lembur, Pending Dinas) serta tabel daftar pengajuan yang membutuhkan keputusan persetujuan.</w:t>
+        <w:t xml:space="preserve"> Terdapat 3 tab utama: 'Pengajuan Izin Pending', 'Pengajuan Lembur Pending', dan 'Pengajuan Dinas Pending'.</w:t>
+      </w:r>
+    </w:p>
+    <w:p>
+      <w:pPr>
+        <w:pStyle w:val="ListBullet"/>
+        <w:spacing w:before="0" w:after="60" w:line="276" w:lineRule="auto"/>
+      </w:pPr>
+      <w:r>
+        <w:rPr>
+          <w:rFonts w:ascii="Arial" w:hAnsi="Arial"/>
+          <w:b/>
+          <w:color w:val="1F2937"/>
+          <w:sz w:val="20"/>
+        </w:rPr>
+        <w:t xml:space="preserve">3. Tinjauan Berkas: </w:t>
+      </w:r>
+      <w:r>
+        <w:rPr>
+          <w:rFonts w:ascii="Arial" w:hAnsi="Arial"/>
+          <w:color w:val="374151"/>
+          <w:sz w:val="20"/>
+        </w:rPr>
+        <w:t xml:space="preserve"> Tabel menampilkan nama pemohon, tanggal kegiatan, durasi/waktu, keterangan, serta tombol aksi cepat.</w:t>
       </w:r>
     </w:p>
     <w:p>
@@ -1344,9 +1378,9 @@
           <w:rFonts w:ascii="Arial" w:hAnsi="Arial"/>
           <w:b/>
           <w:color w:val="A3082F"/>
-          <w:sz w:val="26"/>
+          <w:sz w:val="25"/>
         </w:rPr>
-        <w:t>3.2 Memproses Persetujuan (Approve / Reject)</w:t>
+        <w:t>3.2 Tata Cara Menyetujui (Approve) &amp; Menolak (Reject)</w:t>
       </w:r>
     </w:p>
     <w:p>
@@ -1359,17 +1393,17 @@
           <w:rFonts w:ascii="Arial" w:hAnsi="Arial"/>
           <w:b/>
           <w:color w:val="1F2937"/>
-          <w:sz w:val="21"/>
+          <w:sz w:val="20"/>
         </w:rPr>
-        <w:t xml:space="preserve">1. Peninjauan Data: </w:t>
+        <w:t xml:space="preserve">1. Menyetujui: </w:t>
       </w:r>
       <w:r>
         <w:rPr>
           <w:rFonts w:ascii="Arial" w:hAnsi="Arial"/>
           <w:color w:val="374151"/>
-          <w:sz w:val="21"/>
+          <w:sz w:val="20"/>
         </w:rPr>
-        <w:t xml:space="preserve"> Periksa data pemohon (Nama Karyawan, Jenis Pengajuan, Tanggal, dan Alasan).</w:t>
+        <w:t xml:space="preserve"> Klik tombol 'Setujui' (warna Hijau) untuk menyetujui pengajuan. Status pengajuan langsung berubah menjadi 'Approved', nama penyetujui dan waktu approval otomatis tercatat di sistem.</w:t>
       </w:r>
     </w:p>
     <w:p>
@@ -1382,40 +1416,17 @@
           <w:rFonts w:ascii="Arial" w:hAnsi="Arial"/>
           <w:b/>
           <w:color w:val="1F2937"/>
-          <w:sz w:val="21"/>
+          <w:sz w:val="20"/>
         </w:rPr>
-        <w:t xml:space="preserve">2. Menyetujui (Approve): </w:t>
+        <w:t xml:space="preserve">2. Menolak: </w:t>
       </w:r>
       <w:r>
         <w:rPr>
           <w:rFonts w:ascii="Arial" w:hAnsi="Arial"/>
           <w:color w:val="374151"/>
-          <w:sz w:val="21"/>
+          <w:sz w:val="20"/>
         </w:rPr>
-        <w:t xml:space="preserve"> Klik tombol 'Setujui' (warna Hijau/Accent) untuk menyetujui pengajuan. Status pengajuan otomatis berubah menjadi 'Approved'.</w:t>
-      </w:r>
-    </w:p>
-    <w:p>
-      <w:pPr>
-        <w:pStyle w:val="ListBullet"/>
-        <w:spacing w:before="0" w:after="60" w:line="276" w:lineRule="auto"/>
-      </w:pPr>
-      <w:r>
-        <w:rPr>
-          <w:rFonts w:ascii="Arial" w:hAnsi="Arial"/>
-          <w:b/>
-          <w:color w:val="1F2937"/>
-          <w:sz w:val="21"/>
-        </w:rPr>
-        <w:t xml:space="preserve">3. Menolak (Reject): </w:t>
-      </w:r>
-      <w:r>
-        <w:rPr>
-          <w:rFonts w:ascii="Arial" w:hAnsi="Arial"/>
-          <w:color w:val="374151"/>
-          <w:sz w:val="21"/>
-        </w:rPr>
-        <w:t xml:space="preserve"> Klik tombol 'Tolak' (warna Merah) jika pengajuan tidak sesuai atau ditolak. Status berubah menjadi 'Rejected'.</w:t>
+        <w:t xml:space="preserve"> Klik tombol 'Tolak' (warna Merah) jika permohonan tidak sesuai. Status pengajuan otomatis berubah menjadi 'Rejected'.</w:t>
       </w:r>
     </w:p>
     <w:tbl>
@@ -1456,7 +1467,7 @@
                 <w:color w:val="800020"/>
                 <w:sz w:val="20"/>
               </w:rPr>
-              <w:t>📌 CATATAN SISTEM APPROVAL</w:t>
+              <w:t>📌 INTEGRASI OTOMATIS KE SISTEM PENGGAJIAN</w:t>
               <w:br/>
             </w:r>
             <w:r>
@@ -1465,7 +1476,7 @@
                 <w:color w:val="374151"/>
                 <w:sz w:val="19"/>
               </w:rPr>
-              <w:t>Setiap pengajuan yang telah di-Approve atau di-Reject akan otomatis terekam dalam sistem dan statistik absensi/lembur karyawan bersangkutan akan terbarui.</w:t>
+              <w:t>Data lembur dan dinas luar kantor yang disetujui (Approved) akan otomatis diperhitungkan oleh PayslipService saat Atasan mengkalkulasi slip gaji karyawan pada akhir periode bulan.</w:t>
             </w:r>
           </w:p>
         </w:tc>
@@ -1486,9 +1497,9 @@
           <w:rFonts w:ascii="Arial" w:hAnsi="Arial"/>
           <w:b/>
           <w:color w:val="A3082F"/>
-          <w:sz w:val="26"/>
+          <w:sz w:val="25"/>
         </w:rPr>
-        <w:t>3.3 Rekap Absensi Tim &amp; Laporan Visualisasi Analytics</w:t>
+        <w:t>3.3 Rekapitulasi Presensi Tim &amp; Titik Lokasi Peta</w:t>
       </w:r>
     </w:p>
     <w:p>
@@ -1501,17 +1512,17 @@
           <w:rFonts w:ascii="Arial" w:hAnsi="Arial"/>
           <w:b/>
           <w:color w:val="1F2937"/>
-          <w:sz w:val="21"/>
+          <w:sz w:val="20"/>
         </w:rPr>
-        <w:t xml:space="preserve">1. Rekap Absensi Tim: </w:t>
+        <w:t xml:space="preserve">1. Buka Rekap Absensi: </w:t>
       </w:r>
       <w:r>
         <w:rPr>
           <w:rFonts w:ascii="Arial" w:hAnsi="Arial"/>
           <w:color w:val="374151"/>
-          <w:sz w:val="21"/>
+          <w:sz w:val="20"/>
         </w:rPr>
-        <w:t xml:space="preserve"> Tab 'Rekap Absensi': Menampilkan daftar absensi harian seluruh bawahan beserta filter tanggal, jam masuk, jam keluar, dan koordinat peta lokasi.</w:t>
+        <w:t xml:space="preserve"> Akses menu 'Approval' -&gt; pilih sub-menu 'Rekap Absensi'.</w:t>
       </w:r>
     </w:p>
     <w:p>
@@ -1524,17 +1535,17 @@
           <w:rFonts w:ascii="Arial" w:hAnsi="Arial"/>
           <w:b/>
           <w:color w:val="1F2937"/>
-          <w:sz w:val="21"/>
+          <w:sz w:val="20"/>
         </w:rPr>
-        <w:t xml:space="preserve">2. Visualisasi Laporan: </w:t>
+        <w:t xml:space="preserve">2. Filter Pencarian: </w:t>
       </w:r>
       <w:r>
         <w:rPr>
           <w:rFonts w:ascii="Arial" w:hAnsi="Arial"/>
           <w:color w:val="374151"/>
-          <w:sz w:val="21"/>
+          <w:sz w:val="20"/>
         </w:rPr>
-        <w:t xml:space="preserve"> Tab 'Laporan Visualisasi': Menyajikan grafik ringkasan tingkat kehadiran tim, persentase keterlambatan, serta perbandingan jumlah izin dan lembur bulanan.</w:t>
+        <w:t xml:space="preserve"> Manfaatkan filter pencarian canggih: berdasarkan Nama Karyawan (karyawan &amp; admin), Tanggal Spesifik, Bulan Kerja, atau Status Kehadiran (Hadir, Telat, Alpha).</w:t>
       </w:r>
     </w:p>
     <w:p>
@@ -1547,17 +1558,290 @@
           <w:rFonts w:ascii="Arial" w:hAnsi="Arial"/>
           <w:b/>
           <w:color w:val="1F2937"/>
-          <w:sz w:val="21"/>
+          <w:sz w:val="20"/>
         </w:rPr>
-        <w:t xml:space="preserve">3. Riwayat Keseluruhan: </w:t>
+        <w:t xml:space="preserve">3. Verifikasi Geolocation: </w:t>
       </w:r>
       <w:r>
         <w:rPr>
           <w:rFonts w:ascii="Arial" w:hAnsi="Arial"/>
           <w:color w:val="374151"/>
-          <w:sz w:val="21"/>
+          <w:sz w:val="20"/>
         </w:rPr>
-        <w:t xml:space="preserve"> Tab 'Rekap Pengajuan': Menampilkan seluruh riwayat pengajuan (Izin, Lembur, Dinas) yang telah diproses sebelumnya.</w:t>
+        <w:t xml:space="preserve"> Klik tombol 'Buka Peta' pada setiap baris absensi untuk melihat titik koordinat Google Maps tempat karyawan melakukan check-in/out.</w:t>
+      </w:r>
+    </w:p>
+    <w:p>
+      <w:pPr>
+        <w:keepNext/>
+        <w:spacing w:before="240" w:after="80"/>
+      </w:pPr>
+      <w:r>
+        <w:rPr>
+          <w:rFonts w:ascii="Arial" w:hAnsi="Arial"/>
+          <w:b/>
+          <w:color w:val="A3082F"/>
+          <w:sz w:val="25"/>
+        </w:rPr>
+        <w:t>3.4 Laporan Visualisasi &amp; Statistik Performa Kehadiran</w:t>
+      </w:r>
+    </w:p>
+    <w:p>
+      <w:pPr>
+        <w:pStyle w:val="ListBullet"/>
+        <w:spacing w:before="0" w:after="60" w:line="276" w:lineRule="auto"/>
+      </w:pPr>
+      <w:r>
+        <w:rPr>
+          <w:rFonts w:ascii="Arial" w:hAnsi="Arial"/>
+          <w:b/>
+          <w:color w:val="1F2937"/>
+          <w:sz w:val="20"/>
+        </w:rPr>
+        <w:t xml:space="preserve">1. Buka Laporan: </w:t>
+      </w:r>
+      <w:r>
+        <w:rPr>
+          <w:rFonts w:ascii="Arial" w:hAnsi="Arial"/>
+          <w:color w:val="374151"/>
+          <w:sz w:val="20"/>
+        </w:rPr>
+        <w:t xml:space="preserve"> Buka sub-menu 'Laporan' pada navigasi Approval.</w:t>
+      </w:r>
+    </w:p>
+    <w:p>
+      <w:pPr>
+        <w:pStyle w:val="ListBullet"/>
+        <w:spacing w:before="0" w:after="60" w:line="276" w:lineRule="auto"/>
+      </w:pPr>
+      <w:r>
+        <w:rPr>
+          <w:rFonts w:ascii="Arial" w:hAnsi="Arial"/>
+          <w:b/>
+          <w:color w:val="1F2937"/>
+          <w:sz w:val="20"/>
+        </w:rPr>
+        <w:t xml:space="preserve">2. Grafik Tren Kehadiran: </w:t>
+      </w:r>
+      <w:r>
+        <w:rPr>
+          <w:rFonts w:ascii="Arial" w:hAnsi="Arial"/>
+          <w:color w:val="374151"/>
+          <w:sz w:val="20"/>
+        </w:rPr>
+        <w:t xml:space="preserve"> Memuat grafik harian presensi tim: Tren Hadir Tepat Waktu vs Terlambat sepanjang rentang tanggal terpilih.</w:t>
+      </w:r>
+    </w:p>
+    <w:p>
+      <w:pPr>
+        <w:pStyle w:val="ListBullet"/>
+        <w:spacing w:before="0" w:after="60" w:line="276" w:lineRule="auto"/>
+      </w:pPr>
+      <w:r>
+        <w:rPr>
+          <w:rFonts w:ascii="Arial" w:hAnsi="Arial"/>
+          <w:b/>
+          <w:color w:val="1F2937"/>
+          <w:sz w:val="20"/>
+        </w:rPr>
+        <w:t xml:space="preserve">3. Indikator Kunci: </w:t>
+      </w:r>
+      <w:r>
+        <w:rPr>
+          <w:rFonts w:ascii="Arial" w:hAnsi="Arial"/>
+          <w:color w:val="374151"/>
+          <w:sz w:val="20"/>
+        </w:rPr>
+        <w:t xml:space="preserve"> Kartu Metrik Tim: Menampilkan Total Kehadiran, Total Hari Izin, Total Lembur, dan Total Kunjungan Dinas.</w:t>
+      </w:r>
+    </w:p>
+    <w:p>
+      <w:pPr>
+        <w:pStyle w:val="ListBullet"/>
+        <w:spacing w:before="0" w:after="60" w:line="276" w:lineRule="auto"/>
+      </w:pPr>
+      <w:r>
+        <w:rPr>
+          <w:rFonts w:ascii="Arial" w:hAnsi="Arial"/>
+          <w:b/>
+          <w:color w:val="1F2937"/>
+          <w:sz w:val="20"/>
+        </w:rPr>
+        <w:t xml:space="preserve">4. Tabel Performa Individu: </w:t>
+      </w:r>
+      <w:r>
+        <w:rPr>
+          <w:rFonts w:ascii="Arial" w:hAnsi="Arial"/>
+          <w:color w:val="374151"/>
+          <w:sz w:val="20"/>
+        </w:rPr>
+        <w:t xml:space="preserve"> Tabel Statistik Karyawan: Menampilkan persentase ketepatan waktu, jumlah keterlambatan, dan predikat kedisiplinan kerja masing-masing staf (termasuk staf role Karyawan dan Admin).</w:t>
+      </w:r>
+    </w:p>
+    <w:p>
+      <w:pPr>
+        <w:keepNext/>
+        <w:spacing w:before="240" w:after="80"/>
+      </w:pPr>
+      <w:r>
+        <w:rPr>
+          <w:rFonts w:ascii="Arial" w:hAnsi="Arial"/>
+          <w:b/>
+          <w:color w:val="A3082F"/>
+          <w:sz w:val="25"/>
+        </w:rPr>
+        <w:t>3.5 Modul Manajemen Penggajian (Payroll)</w:t>
+      </w:r>
+    </w:p>
+    <w:p>
+      <w:pPr>
+        <w:spacing w:before="0" w:after="80" w:line="276" w:lineRule="auto"/>
+      </w:pPr>
+      <w:r>
+        <w:rPr>
+          <w:rFonts w:ascii="Arial" w:hAnsi="Arial"/>
+          <w:color w:val="374151"/>
+          <w:sz w:val="20"/>
+        </w:rPr>
+        <w:t>Modul khusus bagi Atasan untuk mengelola seluruh aspek kompensasi finansial tim secara akurat dan transparan.</w:t>
+      </w:r>
+    </w:p>
+    <w:p>
+      <w:pPr>
+        <w:pStyle w:val="ListBullet"/>
+        <w:spacing w:before="0" w:after="60" w:line="276" w:lineRule="auto"/>
+      </w:pPr>
+      <w:r>
+        <w:rPr>
+          <w:rFonts w:ascii="Arial" w:hAnsi="Arial"/>
+          <w:b/>
+          <w:color w:val="1F2937"/>
+          <w:sz w:val="20"/>
+        </w:rPr>
+        <w:t xml:space="preserve">1. Pilih Periode: </w:t>
+      </w:r>
+      <w:r>
+        <w:rPr>
+          <w:rFonts w:ascii="Arial" w:hAnsi="Arial"/>
+          <w:color w:val="374151"/>
+          <w:sz w:val="20"/>
+        </w:rPr>
+        <w:t xml:space="preserve"> Masuk ke menu 'Penggajian'. Tentukan Periode Bulan (format: YYYY-MM) melalui filter periode di bagian atas.</w:t>
+      </w:r>
+    </w:p>
+    <w:p>
+      <w:pPr>
+        <w:pStyle w:val="ListBullet"/>
+        <w:spacing w:before="0" w:after="60" w:line="276" w:lineRule="auto"/>
+      </w:pPr>
+      <w:r>
+        <w:rPr>
+          <w:rFonts w:ascii="Arial" w:hAnsi="Arial"/>
+          <w:b/>
+          <w:color w:val="1F2937"/>
+          <w:sz w:val="20"/>
+        </w:rPr>
+        <w:t xml:space="preserve">2. Atur Tarif Global: </w:t>
+      </w:r>
+      <w:r>
+        <w:rPr>
+          <w:rFonts w:ascii="Arial" w:hAnsi="Arial"/>
+          <w:color w:val="374151"/>
+          <w:sz w:val="20"/>
+        </w:rPr>
+        <w:t xml:space="preserve"> Tab 'Konfigurasi Tarif': Atasan dapat mengatur tarif standar global perusahaan: Tarif Lembur per Jam, Tarif Dinas per Jam, Potongan Alpha per Hari, dan Potongan Izin per Hari. Klik 'Simpan Pengaturan'.</w:t>
+      </w:r>
+    </w:p>
+    <w:p>
+      <w:pPr>
+        <w:pStyle w:val="ListBullet"/>
+        <w:spacing w:before="0" w:after="60" w:line="276" w:lineRule="auto"/>
+      </w:pPr>
+      <w:r>
+        <w:rPr>
+          <w:rFonts w:ascii="Arial" w:hAnsi="Arial"/>
+          <w:b/>
+          <w:color w:val="1F2937"/>
+          <w:sz w:val="20"/>
+        </w:rPr>
+        <w:t xml:space="preserve">3. Atur Gaji Pokok Karyawan: </w:t>
+      </w:r>
+      <w:r>
+        <w:rPr>
+          <w:rFonts w:ascii="Arial" w:hAnsi="Arial"/>
+          <w:color w:val="374151"/>
+          <w:sz w:val="20"/>
+        </w:rPr>
+        <w:t xml:space="preserve"> Tab 'Kelola Gaji Pokok': Menampilkan daftar seluruh karyawan beserta gaji pokok saat ini. Klik tombol pensil/edit untuk mengubah gaji pokok karyawan melalui jendela popup modal.</w:t>
+      </w:r>
+    </w:p>
+    <w:p>
+      <w:pPr>
+        <w:pStyle w:val="ListBullet"/>
+        <w:spacing w:before="0" w:after="60" w:line="276" w:lineRule="auto"/>
+      </w:pPr>
+      <w:r>
+        <w:rPr>
+          <w:rFonts w:ascii="Arial" w:hAnsi="Arial"/>
+          <w:b/>
+          <w:color w:val="1F2937"/>
+          <w:sz w:val="20"/>
+        </w:rPr>
+        <w:t xml:space="preserve">4. Generate Massal: </w:t>
+      </w:r>
+      <w:r>
+        <w:rPr>
+          <w:rFonts w:ascii="Arial" w:hAnsi="Arial"/>
+          <w:color w:val="374151"/>
+          <w:sz w:val="20"/>
+        </w:rPr>
+        <w:t xml:space="preserve"> Tombol 'Kalkulasi / Generate Slip': Klik tombol ini untuk memerintahkan sistem menghitung otomatis seluruh slip gaji karyawan pada periode tersebut. Formula otomatis menggabungkan: Gaji Pokok + (Jam Lembur × Rate) + (Jam Dinas × Rate) - (Hari Alpha × Potongan Alpha) - (Hari Izin × Potongan Izin).</w:t>
+      </w:r>
+    </w:p>
+    <w:p>
+      <w:pPr>
+        <w:pStyle w:val="ListBullet"/>
+        <w:spacing w:before="0" w:after="60" w:line="276" w:lineRule="auto"/>
+      </w:pPr>
+      <w:r>
+        <w:rPr>
+          <w:rFonts w:ascii="Arial" w:hAnsi="Arial"/>
+          <w:b/>
+          <w:color w:val="1F2937"/>
+          <w:sz w:val="20"/>
+        </w:rPr>
+        <w:t xml:space="preserve">5. Verifikasi Rincian: </w:t>
+      </w:r>
+      <w:r>
+        <w:rPr>
+          <w:rFonts w:ascii="Arial" w:hAnsi="Arial"/>
+          <w:color w:val="374151"/>
+          <w:sz w:val="20"/>
+        </w:rPr>
+        <w:t xml:space="preserve"> Tab 'Daftar Slip Gaji': Menampilkan seluruh slip gaji yang telah dihitung. Atasan dapat mengklik 'Rincian' untuk memeriksa detail kalkulasi tiap individu.</w:t>
+      </w:r>
+    </w:p>
+    <w:p>
+      <w:pPr>
+        <w:pStyle w:val="ListBullet"/>
+        <w:spacing w:before="0" w:after="60" w:line="276" w:lineRule="auto"/>
+      </w:pPr>
+      <w:r>
+        <w:rPr>
+          <w:rFonts w:ascii="Arial" w:hAnsi="Arial"/>
+          <w:b/>
+          <w:color w:val="1F2937"/>
+          <w:sz w:val="20"/>
+        </w:rPr>
+        <w:t xml:space="preserve">6. Publikasi ke Karyawan: </w:t>
+      </w:r>
+      <w:r>
+        <w:rPr>
+          <w:rFonts w:ascii="Arial" w:hAnsi="Arial"/>
+          <w:color w:val="374151"/>
+          <w:sz w:val="20"/>
+        </w:rPr>
+        <w:t xml:space="preserve"> Tombol 'Terbitkan Slip Gaji': Setelah seluruh angka terverifikasi, klik tombol 'Terbitkan Slip Gaji'. Status slip gaji akan berubah menjadi 'Terbit' dan otomatis dapat dilihat serta dicetak oleh masing-masing karyawan di menu 'Slip Gaji Saya'.</w:t>
       </w:r>
     </w:p>
     <w:p>
@@ -1570,7 +1854,7 @@
           <w:rFonts w:ascii="Arial" w:hAnsi="Arial"/>
           <w:b/>
           <w:color w:val="800020"/>
-          <w:sz w:val="32"/>
+          <w:sz w:val="30"/>
         </w:rPr>
         <w:t>4. PERTANYAAN UMUM &amp; SOLUSI MASALAH (FAQ)</w:t>
       </w:r>
@@ -1605,7 +1889,7 @@
                 <w:color w:val="FFFFFF"/>
                 <w:sz w:val="20"/>
               </w:rPr>
-              <w:t>Permasalahan / Pertanyaan</w:t>
+              <w:t>Permasalahan / Kendala yang Sering Dihadapi</w:t>
             </w:r>
           </w:p>
         </w:tc>
@@ -1628,7 +1912,7 @@
                 <w:color w:val="FFFFFF"/>
                 <w:sz w:val="20"/>
               </w:rPr>
-              <w:t>Solusi / Langkah Penanganan</w:t>
+              <w:t>Solusi &amp; Tindakan Penanganan</w:t>
             </w:r>
           </w:p>
         </w:tc>
@@ -1652,7 +1936,7 @@
                 <w:color w:val="374151"/>
                 <w:sz w:val="19"/>
               </w:rPr>
-              <w:t>Pesan Error: 'Gagal mengambil lokasi. Pastikan izin lokasi diaktifkan.' saat absen.</w:t>
+              <w:t>Gagal melakukan absensi: 'Gagal mengambil lokasi / Izin lokasi ditolak'.</w:t>
             </w:r>
           </w:p>
         </w:tc>
@@ -1674,13 +1958,11 @@
                 <w:color w:val="374151"/>
                 <w:sz w:val="19"/>
               </w:rPr>
-              <w:t>1. Buka Pengaturan Browser (Browser Settings) -&gt; Privacy and Security -&gt; Site Settings -&gt; Location.</w:t>
+              <w:t>1. Pastikan fitur GPS di HP atau laptop Anda sudah dinyalakan.</w:t>
               <w:br/>
-              <w:t>2. Pastikan alamat web aplikasi diizinkan (Allowed) mengakses lokasi.</w:t>
+              <w:t>2. Masuk ke Pengaturan Browser -&gt; Privacy &amp; Security -&gt; Site Settings -&gt; Location -&gt; pilih 'Allow'.</w:t>
               <w:br/>
-              <w:t>3. Pastikan GPS/Location Service pada smartphone atau laptop Anda aktif.</w:t>
-              <w:br/>
-              <w:t>4. Refresh halaman web dan coba klik tombol Absen kembali.</w:t>
+              <w:t>3. Muat ulang (Refresh) halaman web dan tekan tombol Absen kembali.</w:t>
             </w:r>
           </w:p>
         </w:tc>
@@ -1704,7 +1986,7 @@
                 <w:color w:val="374151"/>
                 <w:sz w:val="19"/>
               </w:rPr>
-              <w:t>Pengajuan Izin / Lembur salah tanggal atau ingin diubah.</w:t>
+              <w:t>Nominal lembur atau dinas luar tidak muncul di slip gaji bulanan.</w:t>
             </w:r>
           </w:p>
         </w:tc>
@@ -1726,7 +2008,7 @@
                 <w:color w:val="374151"/>
                 <w:sz w:val="19"/>
               </w:rPr>
-              <w:t>Pengajuan yang masih berstatus 'Pending' dapat dikoordinasikan dengan Atasan langsung agar ditolak (Reject), kemudian Karyawan dapat membuat pengajuan baru yang benar.</w:t>
+              <w:t>Pastikan pengajuan lembur atau dinas luar Anda telah disetujui (Approved) oleh Atasan. Pengajuan yang masih berstatus 'Pending' atau 'Rejected' tidak akan dikalkulasikan ke dalam slip gaji.</w:t>
             </w:r>
           </w:p>
         </w:tc>
@@ -1750,7 +2032,7 @@
                 <w:color w:val="374151"/>
                 <w:sz w:val="19"/>
               </w:rPr>
-              <w:t>Bagaimana jika lupa password akun?</w:t>
+              <w:t>Karyawan tidak dapat melihat menu 'Slip Gaji Saya' atau slip periode aktif belum ada.</w:t>
             </w:r>
           </w:p>
         </w:tc>
@@ -1772,7 +2054,53 @@
                 <w:color w:val="374151"/>
                 <w:sz w:val="19"/>
               </w:rPr>
-              <w:t>Hubungi Administrator IT / HRD untuk melakukan reset password akun Anda ke password standar awal.</w:t>
+              <w:t>Slip gaji bulanan hanya akan tampil apabila Atasan telah melakukan proses 'Kalkulasi' dan menekan tombol 'Terbitkan Slip Gaji' pada periode bulan bersangkutan.</w:t>
+            </w:r>
+          </w:p>
+        </w:tc>
+      </w:tr>
+      <w:tr>
+        <w:tc>
+          <w:tcPr>
+            <w:tcW w:type="dxa" w:w="4680"/>
+            <w:shd w:fill="FFFFFF"/>
+            <w:tcMar>
+              <w:top w:w="80" w:type="dxa"/>
+              <w:bottom w:w="80" w:type="dxa"/>
+              <w:left w:w="120" w:type="dxa"/>
+              <w:right w:w="120" w:type="dxa"/>
+            </w:tcMar>
+          </w:tcPr>
+          <w:p>
+            <w:r>
+              <w:rPr>
+                <w:rFonts w:ascii="Arial" w:hAnsi="Arial"/>
+                <w:color w:val="374151"/>
+                <w:sz w:val="19"/>
+              </w:rPr>
+              <w:t>Lupa kata sandi (password) akun login.</w:t>
+            </w:r>
+          </w:p>
+        </w:tc>
+        <w:tc>
+          <w:tcPr>
+            <w:tcW w:type="dxa" w:w="4680"/>
+            <w:shd w:fill="FFFFFF"/>
+            <w:tcMar>
+              <w:top w:w="80" w:type="dxa"/>
+              <w:bottom w:w="80" w:type="dxa"/>
+              <w:left w:w="120" w:type="dxa"/>
+              <w:right w:w="120" w:type="dxa"/>
+            </w:tcMar>
+          </w:tcPr>
+          <w:p>
+            <w:r>
+              <w:rPr>
+                <w:rFonts w:ascii="Arial" w:hAnsi="Arial"/>
+                <w:color w:val="374151"/>
+                <w:sz w:val="19"/>
+              </w:rPr>
+              <w:t>Silakan hubungi Administrator IT atau Divisi HRD untuk melakukan pengaturan ulang (reset) kata sandi akun Anda ke password standar perusahaan.</w:t>
             </w:r>
           </w:p>
         </w:tc>
@@ -1788,9 +2116,9 @@
           <w:rFonts w:ascii="Arial" w:hAnsi="Arial"/>
           <w:b/>
           <w:color w:val="800020"/>
-          <w:sz w:val="32"/>
+          <w:sz w:val="30"/>
         </w:rPr>
-        <w:t>5. INFORMASI KONTAK &amp; BANTUAN</w:t>
+        <w:t>5. INFORMASI KONTAK LAYANAN BANTUAN</w:t>
       </w:r>
     </w:p>
     <w:p>
@@ -1801,9 +2129,9 @@
         <w:rPr>
           <w:rFonts w:ascii="Arial" w:hAnsi="Arial"/>
           <w:color w:val="374151"/>
-          <w:sz w:val="21"/>
+          <w:sz w:val="20"/>
         </w:rPr>
-        <w:t>Apabila Anda mengalami kendala teknis atau membutuhkan bantuan lebih lanjut mengenai penggunaan aplikasi, silakan menghubungi tim berikut:</w:t>
+        <w:t>Apabila Anda memerlukan panduan lebih lanjut, kendala akses akun, atau perbaikan data kepegawaian, silakan menghubungi layanan resmi berikut:</w:t>
       </w:r>
     </w:p>
     <w:p>
@@ -1816,15 +2144,15 @@
           <w:rFonts w:ascii="Arial" w:hAnsi="Arial"/>
           <w:b/>
           <w:color w:val="1F2937"/>
-          <w:sz w:val="21"/>
+          <w:sz w:val="20"/>
         </w:rPr>
-        <w:t xml:space="preserve">Email Tim HRD: </w:t>
+        <w:t xml:space="preserve">Divisi HRD &amp; Kepegawaian: </w:t>
       </w:r>
       <w:r>
         <w:rPr>
           <w:rFonts w:ascii="Arial" w:hAnsi="Arial"/>
           <w:color w:val="374151"/>
-          <w:sz w:val="21"/>
+          <w:sz w:val="20"/>
         </w:rPr>
         <w:t xml:space="preserve"> hrd@sinarta-mjs.co.id</w:t>
       </w:r>
@@ -1839,15 +2167,15 @@
           <w:rFonts w:ascii="Arial" w:hAnsi="Arial"/>
           <w:b/>
           <w:color w:val="1F2937"/>
-          <w:sz w:val="21"/>
+          <w:sz w:val="20"/>
         </w:rPr>
-        <w:t xml:space="preserve">Email Tim IT Support: </w:t>
+        <w:t xml:space="preserve">Tim Teknis &amp; IT Support: </w:t>
       </w:r>
       <w:r>
         <w:rPr>
           <w:rFonts w:ascii="Arial" w:hAnsi="Arial"/>
           <w:color w:val="374151"/>
-          <w:sz w:val="21"/>
+          <w:sz w:val="20"/>
         </w:rPr>
         <w:t xml:space="preserve"> it-support@sinarta-mjs.co.id</w:t>
       </w:r>
@@ -1862,17 +2190,17 @@
           <w:rFonts w:ascii="Arial" w:hAnsi="Arial"/>
           <w:b/>
           <w:color w:val="1F2937"/>
-          <w:sz w:val="21"/>
+          <w:sz w:val="20"/>
         </w:rPr>
-        <w:t xml:space="preserve">Jam Operasional Bantuan: </w:t>
+        <w:t xml:space="preserve">Jam Layanan Operasional: </w:t>
       </w:r>
       <w:r>
         <w:rPr>
           <w:rFonts w:ascii="Arial" w:hAnsi="Arial"/>
           <w:color w:val="374151"/>
-          <w:sz w:val="21"/>
+          <w:sz w:val="20"/>
         </w:rPr>
-        <w:t xml:space="preserve"> Senin - Jumat (08:00 - 17:00 WIB)</w:t>
+        <w:t xml:space="preserve"> Senin s/d Jumat, Pukul 08:00 – 17:00 WIB</w:t>
       </w:r>
     </w:p>
     <w:sectPr>

</xml_diff>